<commit_message>
docs: fix checkpoint scope and assign team responsibilities
</commit_message>
<xml_diff>
--- a/docs/agent_specs/01_GM_Agent_HE.docx
+++ b/docs/agent_specs/01_GM_Agent_HE.docx
@@ -58,12 +58,11 @@
       </w:pPr>
       <w:r>
         <w:rPr>
-          <w:rFonts w:ascii="Aptos" w:hAnsi="Aptos" w:eastAsia="Aptos"/>
+          <w:rFonts w:ascii="Arial" w:hAnsi="Arial"/>
           <w:b/>
-          <w:color w:val="147D83"/>
-          <w:sz w:val="18"/>
+          <w:sz w:val="20"/>
         </w:rPr>
-        <w:t>סטטוס מימוש: רכיב יעד חדש — אינו ממומש בזרימת C הקיימת</w:t>
+        <w:t>מחוץ להיקף המאושר לקראת 30.10.2026. עודכן 27.10.2026. רעיון שמור בלבד; אין משימת מימוש. מקור ההיקף: docs/TEAM_SCOPE_HE.md.</w:t>
       </w:r>
     </w:p>
     <w:p>

</xml_diff>